<commit_message>
feat(cheil): one name per common blank across the six templates
Plan item 1. The same information went by a different blank in each
template ([광고주] / [광고주명], [예산 합계] / [RFP에 적힌 예산 규모],
[제출일] / [보고일] / [날짜]). packages/ui/src/cheil-fields.json now
names the ten common blanks once (campaign, client, brand, period,
budget, target, KPI, team, author, date) with their aliases.

- make_templates.py builds the templates from the dictionary and reopens
  each file: an alias, or a non-common blank appearing twice, fails it
- cheil-fields.ts: lookup by name or alias, the hint the one-call fill
  now sends with a common blank, and a campaign card's values for them
- the six templates regenerated; brief, meeting notes, pitch analysis
  and media plan gained the period/budget/KPI/client rows the card fills
- tests/cheil-fields.test.ts opens the shipped templates and checks them

Co-Authored-By: Claude Opus 5.5 <noreply@anthropic.com>
</commit_message>
<xml_diff>
--- a/apps/shell/resources/builtin-skills/cheil-brief/assets/크리에이티브 브리프.docx
+++ b/apps/shell/resources/builtin-skills/cheil-brief/assets/크리에이티브 브리프.docx
@@ -110,6 +110,58 @@
               <w:rPr>
                 <w:b/>
               </w:rPr>
+              <w:t>캠페인 기간</w:t>
+            </w:r>
+          </w:p>
+        </w:tc>
+        <w:tc>
+          <w:tcPr>
+            <w:tcW w:type="dxa" w:w="7143"/>
+          </w:tcPr>
+          <w:p>
+            <w:r>
+              <w:t>[캠페인 기간]</w:t>
+            </w:r>
+          </w:p>
+        </w:tc>
+      </w:tr>
+      <w:tr>
+        <w:tc>
+          <w:tcPr>
+            <w:tcW w:type="dxa" w:w="2268"/>
+            <w:shd w:val="clear" w:color="auto" w:fill="EEF2F8"/>
+          </w:tcPr>
+          <w:p>
+            <w:r>
+              <w:rPr>
+                <w:b/>
+              </w:rPr>
+              <w:t>총예산</w:t>
+            </w:r>
+          </w:p>
+        </w:tc>
+        <w:tc>
+          <w:tcPr>
+            <w:tcW w:type="dxa" w:w="7143"/>
+          </w:tcPr>
+          <w:p>
+            <w:r>
+              <w:t>[총예산]</w:t>
+            </w:r>
+          </w:p>
+        </w:tc>
+      </w:tr>
+      <w:tr>
+        <w:tc>
+          <w:tcPr>
+            <w:tcW w:type="dxa" w:w="2268"/>
+            <w:shd w:val="clear" w:color="auto" w:fill="EEF2F8"/>
+          </w:tcPr>
+          <w:p>
+            <w:r>
+              <w:rPr>
+                <w:b/>
+              </w:rPr>
               <w:t>작성</w:t>
             </w:r>
           </w:p>
@@ -120,7 +172,7 @@
           </w:tcPr>
           <w:p>
             <w:r>
-              <w:t>[작성자 이름 · 팀]</w:t>
+              <w:t>[작성자] · [팀명]</w:t>
             </w:r>
           </w:p>
         </w:tc>
@@ -170,6 +222,14 @@
     </w:p>
     <w:p>
       <w:pPr>
+        <w:pStyle w:val="ListBullet"/>
+      </w:pPr>
+      <w:r>
+        <w:t>목표 KPI: [KPI]</w:t>
+      </w:r>
+    </w:p>
+    <w:p>
+      <w:pPr>
         <w:pStyle w:val="Heading1"/>
       </w:pPr>
       <w:r>
@@ -197,7 +257,7 @@
         <w:pStyle w:val="ListBullet"/>
       </w:pPr>
       <w:r>
-        <w:t>[누구에게 — 나이·생활·구매 맥락]</w:t>
+        <w:t>[타깃]</w:t>
       </w:r>
     </w:p>
     <w:p>

</xml_diff>